<commit_message>
sync to gitlab master repo
</commit_message>
<xml_diff>
--- a/assets/general_purposes_template_v2.docx
+++ b/assets/general_purposes_template_v2.docx
@@ -1,6 +1,6 @@
 
 <file path=word/document.xml><?xml version="1.0" encoding="utf-8"?>
-<w:document xmlns:wpc="http://schemas.microsoft.com/office/word/2010/wordprocessingCanvas" xmlns:cx="http://schemas.microsoft.com/office/drawing/2014/chartex" xmlns:cx1="http://schemas.microsoft.com/office/drawing/2015/9/8/chartex" xmlns:cx2="http://schemas.microsoft.com/office/drawing/2015/10/21/chartex" xmlns:cx3="http://schemas.microsoft.com/office/drawing/2016/5/9/chartex" xmlns:cx4="http://schemas.microsoft.com/office/drawing/2016/5/10/chartex" xmlns:cx5="http://schemas.microsoft.com/office/drawing/2016/5/11/chartex" xmlns:cx6="http://schemas.microsoft.com/office/drawing/2016/5/12/chartex" xmlns:cx7="http://schemas.microsoft.com/office/drawing/2016/5/13/chartex" xmlns:cx8="http://schemas.microsoft.com/office/drawing/2016/5/14/chartex" xmlns:mc="http://schemas.openxmlformats.org/markup-compatibility/2006" xmlns:aink="http://schemas.microsoft.com/office/drawing/2016/ink" xmlns:am3d="http://schemas.microsoft.com/office/drawing/2017/model3d" xmlns:o="urn:schemas-microsoft-com:office:office" xmlns:oel="http://schemas.microsoft.com/office/2019/extlst" xmlns:r="http://schemas.openxmlformats.org/officeDocument/2006/relationships" xmlns:m="http://schemas.openxmlformats.org/officeDocument/2006/math" xmlns:v="urn:schemas-microsoft-com:vml" xmlns:wp14="http://schemas.microsoft.com/office/word/2010/wordprocessingDrawing" xmlns:wp="http://schemas.openxmlformats.org/drawingml/2006/wordprocessingDrawing" xmlns:w10="urn:schemas-microsoft-com:office:word" xmlns:w="http://schemas.openxmlformats.org/wordprocessingml/2006/main" xmlns:w14="http://schemas.microsoft.com/office/word/2010/wordml" xmlns:w15="http://schemas.microsoft.com/office/word/2012/wordml" xmlns:w16cex="http://schemas.microsoft.com/office/word/2018/wordml/cex" xmlns:w16cid="http://schemas.microsoft.com/office/word/2016/wordml/cid" xmlns:w16="http://schemas.microsoft.com/office/word/2018/wordml" xmlns:w16du="http://schemas.microsoft.com/office/word/2023/wordml/word16du" xmlns:w16sdtdh="http://schemas.microsoft.com/office/word/2020/wordml/sdtdatahash" xmlns:w16sdtfl="http://schemas.microsoft.com/office/word/2024/wordml/sdtformatlock" xmlns:w16se="http://schemas.microsoft.com/office/word/2015/wordml/symex" xmlns:wpg="http://schemas.microsoft.com/office/word/2010/wordprocessingGroup" xmlns:wpi="http://schemas.microsoft.com/office/word/2010/wordprocessingInk" xmlns:wne="http://schemas.microsoft.com/office/word/2006/wordml" xmlns:wps="http://schemas.microsoft.com/office/word/2010/wordprocessingShape" mc:Ignorable="w14 w15 w16se w16cid w16 w16cex w16sdtdh w16sdtfl w16du wp14">
+<w:document xmlns:wpc="http://schemas.microsoft.com/office/word/2010/wordprocessingCanvas" xmlns:cx="http://schemas.microsoft.com/office/drawing/2014/chartex" xmlns:cx1="http://schemas.microsoft.com/office/drawing/2015/9/8/chartex" xmlns:cx2="http://schemas.microsoft.com/office/drawing/2015/10/21/chartex" xmlns:cx3="http://schemas.microsoft.com/office/drawing/2016/5/9/chartex" xmlns:cx4="http://schemas.microsoft.com/office/drawing/2016/5/10/chartex" xmlns:cx5="http://schemas.microsoft.com/office/drawing/2016/5/11/chartex" xmlns:cx6="http://schemas.microsoft.com/office/drawing/2016/5/12/chartex" xmlns:cx7="http://schemas.microsoft.com/office/drawing/2016/5/13/chartex" xmlns:cx8="http://schemas.microsoft.com/office/drawing/2016/5/14/chartex" xmlns:mc="http://schemas.openxmlformats.org/markup-compatibility/2006" xmlns:aink="http://schemas.microsoft.com/office/drawing/2016/ink" xmlns:am3d="http://schemas.microsoft.com/office/drawing/2017/model3d" xmlns:o="urn:schemas-microsoft-com:office:office" xmlns:oel="http://schemas.microsoft.com/office/2019/extlst" xmlns:r="http://schemas.openxmlformats.org/officeDocument/2006/relationships" xmlns:m="http://schemas.openxmlformats.org/officeDocument/2006/math" xmlns:v="urn:schemas-microsoft-com:vml" xmlns:wp14="http://schemas.microsoft.com/office/word/2010/wordprocessingDrawing" xmlns:wp="http://schemas.openxmlformats.org/drawingml/2006/wordprocessingDrawing" xmlns:w10="urn:schemas-microsoft-com:office:word" xmlns:w="http://schemas.openxmlformats.org/wordprocessingml/2006/main" xmlns:w14="http://schemas.microsoft.com/office/word/2010/wordml" xmlns:w15="http://schemas.microsoft.com/office/word/2012/wordml" xmlns:w16cex="http://schemas.microsoft.com/office/word/2018/wordml/cex" xmlns:w16cid="http://schemas.microsoft.com/office/word/2016/wordml/cid" xmlns:w16="http://schemas.microsoft.com/office/word/2018/wordml" xmlns:w16sdtdh="http://schemas.microsoft.com/office/word/2020/wordml/sdtdatahash" xmlns:w16se="http://schemas.microsoft.com/office/word/2015/wordml/symex" xmlns:wpg="http://schemas.microsoft.com/office/word/2010/wordprocessingGroup" xmlns:wpi="http://schemas.microsoft.com/office/word/2010/wordprocessingInk" xmlns:wne="http://schemas.microsoft.com/office/word/2006/wordml" xmlns:wps="http://schemas.microsoft.com/office/word/2010/wordprocessingShape" mc:Ignorable="w14 w15 w16se w16cid w16 w16cex w16sdtdh wp14">
   <w:background w:color="FFFFFF"/>
   <w:body>
     <w:p>
@@ -2291,7 +2291,31 @@
           <w:sz w:val="20"/>
           <w:szCs w:val="20"/>
         </w:rPr>
-        <w:t>{% endif %}{% if ecores or avdef %}</w:t>
+        <w:t>{% endif %}</w:t>
+      </w:r>
+      <w:r>
+        <w:rPr>
+          <w:rFonts w:ascii="Poppins Light" w:eastAsia="Poppins Light" w:hAnsi="Poppins Light" w:cs="Poppins Light"/>
+          <w:sz w:val="20"/>
+          <w:szCs w:val="20"/>
+        </w:rPr>
+        <w:t xml:space="preserve">{% if ecores </w:t>
+      </w:r>
+      <w:r>
+        <w:rPr>
+          <w:rFonts w:ascii="Poppins Light" w:eastAsia="Poppins Light" w:hAnsi="Poppins Light" w:cs="Poppins Light"/>
+          <w:sz w:val="20"/>
+          <w:szCs w:val="20"/>
+        </w:rPr>
+        <w:t>or</w:t>
+      </w:r>
+      <w:r>
+        <w:rPr>
+          <w:rFonts w:ascii="Poppins Light" w:eastAsia="Poppins Light" w:hAnsi="Poppins Light" w:cs="Poppins Light"/>
+          <w:sz w:val="20"/>
+          <w:szCs w:val="20"/>
+        </w:rPr>
+        <w:t xml:space="preserve"> avdef %}</w:t>
       </w:r>
       <w:r>
         <w:rPr>
@@ -2832,7 +2856,15 @@
           <w:sz w:val="20"/>
           <w:szCs w:val="20"/>
         </w:rPr>
-        <w:t xml:space="preserve">has_peatland </w:t>
+        <w:t>has_peatland</w:t>
+      </w:r>
+      <w:r>
+        <w:rPr>
+          <w:rFonts w:ascii="Poppins Light" w:eastAsia="Poppins Light" w:hAnsi="Poppins Light" w:cs="Poppins Light"/>
+          <w:sz w:val="20"/>
+          <w:szCs w:val="20"/>
+        </w:rPr>
+        <w:t xml:space="preserve"> </w:t>
       </w:r>
       <w:r>
         <w:rPr>
@@ -3226,7 +3258,23 @@
           <w:sz w:val="20"/>
           <w:szCs w:val="20"/>
         </w:rPr>
-        <w:t>{% if more_than_1_driver %}</w:t>
+        <w:t xml:space="preserve">{% if </w:t>
+      </w:r>
+      <w:r>
+        <w:rPr>
+          <w:rFonts w:ascii="Poppins Light" w:eastAsia="Poppins Light" w:hAnsi="Poppins Light" w:cs="Poppins Light"/>
+          <w:sz w:val="20"/>
+          <w:szCs w:val="20"/>
+        </w:rPr>
+        <w:t>more_than_1_driver</w:t>
+      </w:r>
+      <w:r>
+        <w:rPr>
+          <w:rFonts w:ascii="Poppins Light" w:eastAsia="Poppins Light" w:hAnsi="Poppins Light" w:cs="Poppins Light"/>
+          <w:sz w:val="20"/>
+          <w:szCs w:val="20"/>
+        </w:rPr>
+        <w:t xml:space="preserve"> %}</w:t>
       </w:r>
       <w:r>
         <w:rPr>
@@ -4105,10 +4153,7 @@
         </w:tc>
       </w:tr>
     </w:tbl>
-    <w:p>
-      <w:bookmarkStart w:id="12" w:name="_y12q5rkbxijj" w:colFirst="0" w:colLast="0"/>
-      <w:bookmarkEnd w:id="12"/>
-    </w:p>
+    <w:p/>
     <w:p>
       <w:pPr>
         <w:rPr>
@@ -4624,7 +4669,47 @@
                 <w:szCs w:val="20"/>
               </w:rPr>
               <w:lastRenderedPageBreak/>
-              <w:t>{{species["category_iucn"]}}</w:t>
+              <w:t>{{species["</w:t>
+            </w:r>
+            <w:r>
+              <w:rPr>
+                <w:rFonts w:ascii="Poppins Light" w:eastAsia="Poppins Light" w:hAnsi="Poppins Light" w:cs="Poppins Light"/>
+                <w:iCs/>
+                <w:color w:val="1F497D"/>
+                <w:sz w:val="20"/>
+                <w:szCs w:val="20"/>
+              </w:rPr>
+              <w:t>category</w:t>
+            </w:r>
+            <w:r>
+              <w:rPr>
+                <w:rFonts w:ascii="Poppins Light" w:eastAsia="Poppins Light" w:hAnsi="Poppins Light" w:cs="Poppins Light"/>
+                <w:iCs/>
+                <w:color w:val="1F497D"/>
+                <w:sz w:val="20"/>
+                <w:szCs w:val="20"/>
+              </w:rPr>
+              <w:t>_</w:t>
+            </w:r>
+            <w:r>
+              <w:rPr>
+                <w:rFonts w:ascii="Poppins Light" w:eastAsia="Poppins Light" w:hAnsi="Poppins Light" w:cs="Poppins Light"/>
+                <w:iCs/>
+                <w:color w:val="1F497D"/>
+                <w:sz w:val="20"/>
+                <w:szCs w:val="20"/>
+              </w:rPr>
+              <w:t>iucn</w:t>
+            </w:r>
+            <w:r>
+              <w:rPr>
+                <w:rFonts w:ascii="Poppins Light" w:eastAsia="Poppins Light" w:hAnsi="Poppins Light" w:cs="Poppins Light"/>
+                <w:iCs/>
+                <w:color w:val="1F497D"/>
+                <w:sz w:val="20"/>
+                <w:szCs w:val="20"/>
+              </w:rPr>
+              <w:t>"]}}</w:t>
             </w:r>
           </w:p>
           <w:p>
@@ -4701,7 +4786,6 @@
                 <w:sz w:val="20"/>
                 <w:szCs w:val="20"/>
               </w:rPr>
-              <w:lastRenderedPageBreak/>
               <w:t>Mammals</w:t>
             </w:r>
           </w:p>
@@ -5564,17 +5648,21 @@
           <w:szCs w:val="20"/>
         </w:rPr>
       </w:pPr>
-      <w:bookmarkStart w:id="13" w:name="_mhom2vj78fag" w:colFirst="0" w:colLast="0"/>
-      <w:bookmarkStart w:id="14" w:name="_hhj918t3ezo1" w:colFirst="0" w:colLast="0"/>
-      <w:bookmarkEnd w:id="13"/>
-      <w:bookmarkEnd w:id="14"/>
-      <w:r>
-        <w:rPr>
-          <w:rFonts w:ascii="Poppins Light" w:eastAsia="Poppins Light" w:hAnsi="Poppins Light" w:cs="Poppins Light"/>
-          <w:sz w:val="20"/>
-          <w:szCs w:val="20"/>
-        </w:rPr>
-        <w:t xml:space="preserve">{% if has_tcl %}The selected area overlaps with </w:t>
+      <w:r>
+        <w:rPr>
+          <w:rFonts w:ascii="Poppins Light" w:eastAsia="Poppins Light" w:hAnsi="Poppins Light" w:cs="Poppins Light"/>
+          <w:sz w:val="20"/>
+          <w:szCs w:val="20"/>
+        </w:rPr>
+        <w:t>{% if has_tcl %}</w:t>
+      </w:r>
+      <w:r>
+        <w:rPr>
+          <w:rFonts w:ascii="Poppins Light" w:eastAsia="Poppins Light" w:hAnsi="Poppins Light" w:cs="Poppins Light"/>
+          <w:sz w:val="20"/>
+          <w:szCs w:val="20"/>
+        </w:rPr>
+        <w:t xml:space="preserve">The selected area overlaps with </w:t>
       </w:r>
       <w:r>
         <w:rPr>
@@ -5626,13 +5714,23 @@
           <w:sz w:val="20"/>
           <w:szCs w:val="20"/>
         </w:rPr>
-        <w:t>. These areas are vital for tiger conservation as they indicate confirmed tiger presence within the last five years. This is a crucial habitat that requires protection and conservation efforts to ensure the sustainability of tiger populations.{% endif %}</w:t>
+        <w:t>. These areas are vital for tiger conservation as they indicate confirmed tiger presence within the last five years. This is a crucial habitat that requires protection and conservation efforts to ensure the sustainability of tiger populations.</w:t>
+      </w:r>
+      <w:r>
+        <w:rPr>
+          <w:rFonts w:ascii="Poppins Light" w:eastAsia="Poppins Light" w:hAnsi="Poppins Light" w:cs="Poppins Light"/>
+          <w:sz w:val="20"/>
+          <w:szCs w:val="20"/>
+        </w:rPr>
+        <w:t>{% endif %}</w:t>
       </w:r>
     </w:p>
     <w:p>
       <w:pPr>
         <w:pStyle w:val="Heading2"/>
       </w:pPr>
+      <w:bookmarkStart w:id="12" w:name="_y12q5rkbxijj" w:colFirst="0" w:colLast="0"/>
+      <w:bookmarkEnd w:id="12"/>
       <w:r>
         <w:t>People</w:t>
       </w:r>
@@ -5809,7 +5907,16 @@
           <w:sz w:val="20"/>
           <w:szCs w:val="20"/>
         </w:rPr>
-        <w:t>{demography["</w:t>
+        <w:t>{</w:t>
+      </w:r>
+      <w:r>
+        <w:rPr>
+          <w:rFonts w:ascii="Poppins Light" w:eastAsia="Poppins Light" w:hAnsi="Poppins Light" w:cs="Poppins Light"/>
+          <w:color w:val="1F497D"/>
+          <w:sz w:val="20"/>
+          <w:szCs w:val="20"/>
+        </w:rPr>
+        <w:t>demography["</w:t>
       </w:r>
       <w:r>
         <w:rPr>
@@ -5827,7 +5934,16 @@
           <w:sz w:val="20"/>
           <w:szCs w:val="20"/>
         </w:rPr>
-        <w:t>"]}}</w:t>
+        <w:t>"]</w:t>
+      </w:r>
+      <w:r>
+        <w:rPr>
+          <w:rFonts w:ascii="Poppins Light" w:eastAsia="Poppins Light" w:hAnsi="Poppins Light" w:cs="Poppins Light"/>
+          <w:color w:val="1F497D"/>
+          <w:sz w:val="20"/>
+          <w:szCs w:val="20"/>
+        </w:rPr>
+        <w:t>}}</w:t>
       </w:r>
       <w:r>
         <w:rPr>
@@ -6065,16 +6181,51 @@
           <w:sz w:val="20"/>
           <w:szCs w:val="20"/>
         </w:rPr>
-        <w:t xml:space="preserve">{% if has_ethnic %}Within this area potentially overlaps with several groups of local community, including the </w:t>
-      </w:r>
-      <w:r>
-        <w:rPr>
-          <w:rFonts w:ascii="Poppins Light" w:eastAsia="Poppins Light" w:hAnsi="Poppins Light" w:cs="Poppins Light"/>
-          <w:color w:val="1F497D"/>
-          <w:sz w:val="20"/>
-          <w:szCs w:val="20"/>
-        </w:rPr>
-        <w:t>{{ethnics}}.{% endif %}</w:t>
+        <w:t>{% if has_ethnic %}</w:t>
+      </w:r>
+      <w:r>
+        <w:rPr>
+          <w:rFonts w:ascii="Poppins Light" w:eastAsia="Poppins Light" w:hAnsi="Poppins Light" w:cs="Poppins Light"/>
+          <w:sz w:val="20"/>
+          <w:szCs w:val="20"/>
+        </w:rPr>
+        <w:t xml:space="preserve">Within this area potentially overlaps with several groups of local community, including the </w:t>
+      </w:r>
+      <w:r>
+        <w:rPr>
+          <w:rFonts w:ascii="Poppins Light" w:eastAsia="Poppins Light" w:hAnsi="Poppins Light" w:cs="Poppins Light"/>
+          <w:color w:val="1F497D"/>
+          <w:sz w:val="20"/>
+          <w:szCs w:val="20"/>
+        </w:rPr>
+        <w:t>{</w:t>
+      </w:r>
+      <w:r>
+        <w:rPr>
+          <w:rFonts w:ascii="Poppins Light" w:eastAsia="Poppins Light" w:hAnsi="Poppins Light" w:cs="Poppins Light"/>
+          <w:color w:val="1F497D"/>
+          <w:sz w:val="20"/>
+          <w:szCs w:val="20"/>
+        </w:rPr>
+        <w:t>{ethnics}}</w:t>
+      </w:r>
+      <w:r>
+        <w:rPr>
+          <w:rFonts w:ascii="Poppins Light" w:eastAsia="Poppins Light" w:hAnsi="Poppins Light" w:cs="Poppins Light"/>
+          <w:color w:val="1F497D"/>
+          <w:sz w:val="20"/>
+          <w:szCs w:val="20"/>
+        </w:rPr>
+        <w:t>.</w:t>
+      </w:r>
+      <w:r>
+        <w:rPr>
+          <w:rFonts w:ascii="Poppins Light" w:eastAsia="Poppins Light" w:hAnsi="Poppins Light" w:cs="Poppins Light"/>
+          <w:color w:val="1F497D"/>
+          <w:sz w:val="20"/>
+          <w:szCs w:val="20"/>
+        </w:rPr>
+        <w:t>{% endif %}</w:t>
       </w:r>
     </w:p>
     <w:p>
@@ -6718,6 +6869,8 @@
       <w:pPr>
         <w:pStyle w:val="Heading2"/>
       </w:pPr>
+      <w:bookmarkStart w:id="13" w:name="_hhj918t3ezo1" w:colFirst="0" w:colLast="0"/>
+      <w:bookmarkEnd w:id="13"/>
       <w:r>
         <w:t>Climate</w:t>
       </w:r>
@@ -7251,7 +7404,16 @@
           <w:sz w:val="20"/>
           <w:szCs w:val="20"/>
         </w:rPr>
-        <w:t>{carbon_storage["</w:t>
+        <w:t>{</w:t>
+      </w:r>
+      <w:r>
+        <w:rPr>
+          <w:rFonts w:ascii="Poppins Light" w:eastAsia="Poppins Light" w:hAnsi="Poppins Light" w:cs="Poppins Light"/>
+          <w:color w:val="1F497D"/>
+          <w:sz w:val="20"/>
+          <w:szCs w:val="20"/>
+        </w:rPr>
+        <w:t>carbon_storage["</w:t>
       </w:r>
       <w:r>
         <w:rPr>
@@ -7269,7 +7431,16 @@
           <w:sz w:val="20"/>
           <w:szCs w:val="20"/>
         </w:rPr>
-        <w:t>"]}}</w:t>
+        <w:t>"]</w:t>
+      </w:r>
+      <w:r>
+        <w:rPr>
+          <w:rFonts w:ascii="Poppins Light" w:eastAsia="Poppins Light" w:hAnsi="Poppins Light" w:cs="Poppins Light"/>
+          <w:color w:val="1F497D"/>
+          <w:sz w:val="20"/>
+          <w:szCs w:val="20"/>
+        </w:rPr>
+        <w:t>}}</w:t>
       </w:r>
       <w:r>
         <w:rPr>
@@ -7304,7 +7475,16 @@
           <w:sz w:val="20"/>
           <w:szCs w:val="20"/>
         </w:rPr>
-        <w:t>{carbon_storage["</w:t>
+        <w:t>{</w:t>
+      </w:r>
+      <w:r>
+        <w:rPr>
+          <w:rFonts w:ascii="Poppins Light" w:eastAsia="Poppins Light" w:hAnsi="Poppins Light" w:cs="Poppins Light"/>
+          <w:color w:val="1F497D"/>
+          <w:sz w:val="20"/>
+          <w:szCs w:val="20"/>
+        </w:rPr>
+        <w:t>carbon_storage["</w:t>
       </w:r>
       <w:r>
         <w:rPr>
@@ -7322,7 +7502,16 @@
           <w:sz w:val="20"/>
           <w:szCs w:val="20"/>
         </w:rPr>
-        <w:t>"]}}</w:t>
+        <w:t>"]</w:t>
+      </w:r>
+      <w:r>
+        <w:rPr>
+          <w:rFonts w:ascii="Poppins Light" w:eastAsia="Poppins Light" w:hAnsi="Poppins Light" w:cs="Poppins Light"/>
+          <w:color w:val="1F497D"/>
+          <w:sz w:val="20"/>
+          <w:szCs w:val="20"/>
+        </w:rPr>
+        <w:t>}}</w:t>
       </w:r>
       <w:r>
         <w:rPr>
@@ -7410,7 +7599,16 @@
           <w:sz w:val="20"/>
           <w:szCs w:val="20"/>
         </w:rPr>
-        <w:t>{carbon_storage["</w:t>
+        <w:t>{</w:t>
+      </w:r>
+      <w:r>
+        <w:rPr>
+          <w:rFonts w:ascii="Poppins Light" w:eastAsia="Poppins Light" w:hAnsi="Poppins Light" w:cs="Poppins Light"/>
+          <w:color w:val="1F497D"/>
+          <w:sz w:val="20"/>
+          <w:szCs w:val="20"/>
+        </w:rPr>
+        <w:t>carbon_storage["</w:t>
       </w:r>
       <w:r>
         <w:rPr>
@@ -7428,7 +7626,25 @@
           <w:sz w:val="20"/>
           <w:szCs w:val="20"/>
         </w:rPr>
-        <w:t>percent"]}}</w:t>
+        <w:t>percent</w:t>
+      </w:r>
+      <w:r>
+        <w:rPr>
+          <w:rFonts w:ascii="Poppins Light" w:eastAsia="Poppins Light" w:hAnsi="Poppins Light" w:cs="Poppins Light"/>
+          <w:color w:val="1F497D"/>
+          <w:sz w:val="20"/>
+          <w:szCs w:val="20"/>
+        </w:rPr>
+        <w:t>"]</w:t>
+      </w:r>
+      <w:r>
+        <w:rPr>
+          <w:rFonts w:ascii="Poppins Light" w:eastAsia="Poppins Light" w:hAnsi="Poppins Light" w:cs="Poppins Light"/>
+          <w:color w:val="1F497D"/>
+          <w:sz w:val="20"/>
+          <w:szCs w:val="20"/>
+        </w:rPr>
+        <w:t>}}</w:t>
       </w:r>
       <w:r>
         <w:rPr>
@@ -7472,7 +7688,16 @@
           <w:sz w:val="20"/>
           <w:szCs w:val="20"/>
         </w:rPr>
-        <w:t>carbon_storage["soil</w:t>
+        <w:t>carbon_storage["</w:t>
+      </w:r>
+      <w:r>
+        <w:rPr>
+          <w:rFonts w:ascii="Poppins Light" w:eastAsia="Poppins Light" w:hAnsi="Poppins Light" w:cs="Poppins Light"/>
+          <w:color w:val="1F497D"/>
+          <w:sz w:val="20"/>
+          <w:szCs w:val="20"/>
+        </w:rPr>
+        <w:t>soil</w:t>
       </w:r>
       <w:r>
         <w:rPr>
@@ -7490,7 +7715,16 @@
           <w:sz w:val="20"/>
           <w:szCs w:val="20"/>
         </w:rPr>
-        <w:t>"]}}</w:t>
+        <w:t>"]</w:t>
+      </w:r>
+      <w:r>
+        <w:rPr>
+          <w:rFonts w:ascii="Poppins Light" w:eastAsia="Poppins Light" w:hAnsi="Poppins Light" w:cs="Poppins Light"/>
+          <w:color w:val="1F497D"/>
+          <w:sz w:val="20"/>
+          <w:szCs w:val="20"/>
+        </w:rPr>
+        <w:t>}}</w:t>
       </w:r>
       <w:r>
         <w:rPr>
@@ -7516,7 +7750,43 @@
           <w:sz w:val="20"/>
           <w:szCs w:val="20"/>
         </w:rPr>
-        <w:t>{carbon_storage["soil_percent"]}}</w:t>
+        <w:t>{</w:t>
+      </w:r>
+      <w:r>
+        <w:rPr>
+          <w:rFonts w:ascii="Poppins Light" w:eastAsia="Poppins Light" w:hAnsi="Poppins Light" w:cs="Poppins Light"/>
+          <w:color w:val="1F497D"/>
+          <w:sz w:val="20"/>
+          <w:szCs w:val="20"/>
+        </w:rPr>
+        <w:t>carbon_storage["</w:t>
+      </w:r>
+      <w:r>
+        <w:rPr>
+          <w:rFonts w:ascii="Poppins Light" w:eastAsia="Poppins Light" w:hAnsi="Poppins Light" w:cs="Poppins Light"/>
+          <w:color w:val="1F497D"/>
+          <w:sz w:val="20"/>
+          <w:szCs w:val="20"/>
+        </w:rPr>
+        <w:t>soil_percent</w:t>
+      </w:r>
+      <w:r>
+        <w:rPr>
+          <w:rFonts w:ascii="Poppins Light" w:eastAsia="Poppins Light" w:hAnsi="Poppins Light" w:cs="Poppins Light"/>
+          <w:color w:val="1F497D"/>
+          <w:sz w:val="20"/>
+          <w:szCs w:val="20"/>
+        </w:rPr>
+        <w:t>"]</w:t>
+      </w:r>
+      <w:r>
+        <w:rPr>
+          <w:rFonts w:ascii="Poppins Light" w:eastAsia="Poppins Light" w:hAnsi="Poppins Light" w:cs="Poppins Light"/>
+          <w:color w:val="1F497D"/>
+          <w:sz w:val="20"/>
+          <w:szCs w:val="20"/>
+        </w:rPr>
+        <w:t>}}</w:t>
       </w:r>
       <w:r>
         <w:rPr>
@@ -7559,7 +7829,16 @@
           <w:sz w:val="20"/>
           <w:szCs w:val="20"/>
         </w:rPr>
-        <w:t>{carbon_storage["</w:t>
+        <w:t>{</w:t>
+      </w:r>
+      <w:r>
+        <w:rPr>
+          <w:rFonts w:ascii="Poppins Light" w:eastAsia="Poppins Light" w:hAnsi="Poppins Light" w:cs="Poppins Light"/>
+          <w:color w:val="1F497D"/>
+          <w:sz w:val="20"/>
+          <w:szCs w:val="20"/>
+        </w:rPr>
+        <w:t>carbon_storage["</w:t>
       </w:r>
       <w:r>
         <w:rPr>
@@ -7577,7 +7856,16 @@
           <w:sz w:val="20"/>
           <w:szCs w:val="20"/>
         </w:rPr>
-        <w:t>"]}}</w:t>
+        <w:t>"]</w:t>
+      </w:r>
+      <w:r>
+        <w:rPr>
+          <w:rFonts w:ascii="Poppins Light" w:eastAsia="Poppins Light" w:hAnsi="Poppins Light" w:cs="Poppins Light"/>
+          <w:color w:val="1F497D"/>
+          <w:sz w:val="20"/>
+          <w:szCs w:val="20"/>
+        </w:rPr>
+        <w:t>}}</w:t>
       </w:r>
       <w:r>
         <w:rPr>
@@ -7619,7 +7907,15 @@
           <w:sz w:val="20"/>
           <w:szCs w:val="20"/>
         </w:rPr>
-        <w:t>"] &gt; 0 %}Over the past decade, the project area has been affected by fires</w:t>
+        <w:t>"] &gt; 0 %}</w:t>
+      </w:r>
+      <w:r>
+        <w:rPr>
+          <w:rFonts w:ascii="Poppins Light" w:eastAsia="Poppins Light" w:hAnsi="Poppins Light" w:cs="Poppins Light"/>
+          <w:sz w:val="20"/>
+          <w:szCs w:val="20"/>
+        </w:rPr>
+        <w:t>Over the past decade, the project area has been affected by fires</w:t>
       </w:r>
       <w:r>
         <w:rPr>
@@ -7733,7 +8029,15 @@
           <w:sz w:val="20"/>
           <w:szCs w:val="20"/>
         </w:rPr>
-        <w:t>occurrences in several areas. This history of fire events underscores the importance of fire management and mitigation strategies to preserve the integrity of the ecosystem.{% endif %}</w:t>
+        <w:t>occurrences in several areas. This history of fire events underscores the importance of fire management and mitigation strategies to preserve the integrity of the ecosystem.</w:t>
+      </w:r>
+      <w:r>
+        <w:rPr>
+          <w:rFonts w:ascii="Poppins Light" w:eastAsia="Poppins Light" w:hAnsi="Poppins Light" w:cs="Poppins Light"/>
+          <w:sz w:val="20"/>
+          <w:szCs w:val="20"/>
+        </w:rPr>
+        <w:t>{% endif %}</w:t>
       </w:r>
     </w:p>
     <w:p>
@@ -7746,6 +8050,8 @@
           <w:szCs w:val="20"/>
         </w:rPr>
       </w:pPr>
+      <w:bookmarkStart w:id="14" w:name="_mhom2vj78fag" w:colFirst="0" w:colLast="0"/>
+      <w:bookmarkEnd w:id="14"/>
       <w:r>
         <w:rPr>
           <w:rFonts w:ascii="Poppins Light" w:eastAsia="Poppins Light" w:hAnsi="Poppins Light" w:cs="Poppins Light"/>
@@ -8035,7 +8341,25 @@
           <w:sz w:val="20"/>
           <w:szCs w:val="20"/>
         </w:rPr>
-        <w:t>{benefit[“eligibility”][“ecores”]}}</w:t>
+        <w:t>{</w:t>
+      </w:r>
+      <w:r>
+        <w:rPr>
+          <w:rFonts w:ascii="Poppins Light" w:eastAsia="Poppins Light" w:hAnsi="Poppins Light" w:cs="Poppins Light"/>
+          <w:color w:val="1F497D"/>
+          <w:sz w:val="20"/>
+          <w:szCs w:val="20"/>
+        </w:rPr>
+        <w:t>benefit[“eligibility”][“ecores”]</w:t>
+      </w:r>
+      <w:r>
+        <w:rPr>
+          <w:rFonts w:ascii="Poppins Light" w:eastAsia="Poppins Light" w:hAnsi="Poppins Light" w:cs="Poppins Light"/>
+          <w:color w:val="1F497D"/>
+          <w:sz w:val="20"/>
+          <w:szCs w:val="20"/>
+        </w:rPr>
+        <w:t>}}</w:t>
       </w:r>
       <w:r>
         <w:rPr>
@@ -8061,7 +8385,25 @@
           <w:sz w:val="20"/>
           <w:szCs w:val="20"/>
         </w:rPr>
-        <w:t>{benefit[“eligibility”][“ecores_pct”]}}</w:t>
+        <w:t>{</w:t>
+      </w:r>
+      <w:r>
+        <w:rPr>
+          <w:rFonts w:ascii="Poppins Light" w:eastAsia="Poppins Light" w:hAnsi="Poppins Light" w:cs="Poppins Light"/>
+          <w:color w:val="1F497D"/>
+          <w:sz w:val="20"/>
+          <w:szCs w:val="20"/>
+        </w:rPr>
+        <w:t>benefit[“eligibility”][“ecores_pct”]</w:t>
+      </w:r>
+      <w:r>
+        <w:rPr>
+          <w:rFonts w:ascii="Poppins Light" w:eastAsia="Poppins Light" w:hAnsi="Poppins Light" w:cs="Poppins Light"/>
+          <w:color w:val="1F497D"/>
+          <w:sz w:val="20"/>
+          <w:szCs w:val="20"/>
+        </w:rPr>
+        <w:t>}}</w:t>
       </w:r>
       <w:r>
         <w:rPr>
@@ -8111,7 +8453,43 @@
           <w:sz w:val="20"/>
           <w:szCs w:val="20"/>
         </w:rPr>
-        <w:t>{benefit[“eligibility”][“avdef”]}}</w:t>
+        <w:t>{</w:t>
+      </w:r>
+      <w:r>
+        <w:rPr>
+          <w:rFonts w:ascii="Poppins Light" w:eastAsia="Poppins Light" w:hAnsi="Poppins Light" w:cs="Poppins Light"/>
+          <w:color w:val="1F497D"/>
+          <w:sz w:val="20"/>
+          <w:szCs w:val="20"/>
+        </w:rPr>
+        <w:t>benefit[“eligibility”][“</w:t>
+      </w:r>
+      <w:r>
+        <w:rPr>
+          <w:rFonts w:ascii="Poppins Light" w:eastAsia="Poppins Light" w:hAnsi="Poppins Light" w:cs="Poppins Light"/>
+          <w:color w:val="1F497D"/>
+          <w:sz w:val="20"/>
+          <w:szCs w:val="20"/>
+        </w:rPr>
+        <w:t>avdef</w:t>
+      </w:r>
+      <w:r>
+        <w:rPr>
+          <w:rFonts w:ascii="Poppins Light" w:eastAsia="Poppins Light" w:hAnsi="Poppins Light" w:cs="Poppins Light"/>
+          <w:color w:val="1F497D"/>
+          <w:sz w:val="20"/>
+          <w:szCs w:val="20"/>
+        </w:rPr>
+        <w:t>”]</w:t>
+      </w:r>
+      <w:r>
+        <w:rPr>
+          <w:rFonts w:ascii="Poppins Light" w:eastAsia="Poppins Light" w:hAnsi="Poppins Light" w:cs="Poppins Light"/>
+          <w:color w:val="1F497D"/>
+          <w:sz w:val="20"/>
+          <w:szCs w:val="20"/>
+        </w:rPr>
+        <w:t>}}</w:t>
       </w:r>
       <w:r>
         <w:rPr>
@@ -8137,7 +8515,43 @@
           <w:sz w:val="20"/>
           <w:szCs w:val="20"/>
         </w:rPr>
-        <w:t>{benefit[“eligibility”][“avdef_pct”]}}</w:t>
+        <w:t>{</w:t>
+      </w:r>
+      <w:r>
+        <w:rPr>
+          <w:rFonts w:ascii="Poppins Light" w:eastAsia="Poppins Light" w:hAnsi="Poppins Light" w:cs="Poppins Light"/>
+          <w:color w:val="1F497D"/>
+          <w:sz w:val="20"/>
+          <w:szCs w:val="20"/>
+        </w:rPr>
+        <w:t>benefit[“eligibility”][“avdef</w:t>
+      </w:r>
+      <w:r>
+        <w:rPr>
+          <w:rFonts w:ascii="Poppins Light" w:eastAsia="Poppins Light" w:hAnsi="Poppins Light" w:cs="Poppins Light"/>
+          <w:color w:val="1F497D"/>
+          <w:sz w:val="20"/>
+          <w:szCs w:val="20"/>
+        </w:rPr>
+        <w:t>_pct</w:t>
+      </w:r>
+      <w:r>
+        <w:rPr>
+          <w:rFonts w:ascii="Poppins Light" w:eastAsia="Poppins Light" w:hAnsi="Poppins Light" w:cs="Poppins Light"/>
+          <w:color w:val="1F497D"/>
+          <w:sz w:val="20"/>
+          <w:szCs w:val="20"/>
+        </w:rPr>
+        <w:t>”]</w:t>
+      </w:r>
+      <w:r>
+        <w:rPr>
+          <w:rFonts w:ascii="Poppins Light" w:eastAsia="Poppins Light" w:hAnsi="Poppins Light" w:cs="Poppins Light"/>
+          <w:color w:val="1F497D"/>
+          <w:sz w:val="20"/>
+          <w:szCs w:val="20"/>
+        </w:rPr>
+        <w:t>}}</w:t>
       </w:r>
       <w:r>
         <w:rPr>
@@ -8333,7 +8747,23 @@
           <w:sz w:val="20"/>
           <w:szCs w:val="20"/>
         </w:rPr>
-        <w:t>{% if avdef %}</w:t>
+        <w:t xml:space="preserve">{% </w:t>
+      </w:r>
+      <w:r>
+        <w:rPr>
+          <w:rFonts w:ascii="Poppins Light" w:eastAsia="Poppins Light" w:hAnsi="Poppins Light" w:cs="Poppins Light"/>
+          <w:sz w:val="20"/>
+          <w:szCs w:val="20"/>
+        </w:rPr>
+        <w:t>if avdef</w:t>
+      </w:r>
+      <w:r>
+        <w:rPr>
+          <w:rFonts w:ascii="Poppins Light" w:eastAsia="Poppins Light" w:hAnsi="Poppins Light" w:cs="Poppins Light"/>
+          <w:sz w:val="20"/>
+          <w:szCs w:val="20"/>
+        </w:rPr>
+        <w:t xml:space="preserve"> %}</w:t>
       </w:r>
     </w:p>
     <w:p>
@@ -8661,7 +9091,16 @@
           <w:sz w:val="20"/>
           <w:szCs w:val="20"/>
         </w:rPr>
-        <w:t>{benefit["aoh"]["</w:t>
+        <w:t>{</w:t>
+      </w:r>
+      <w:r>
+        <w:rPr>
+          <w:rFonts w:ascii="Poppins Light" w:eastAsia="Poppins Light" w:hAnsi="Poppins Light" w:cs="Poppins Light"/>
+          <w:color w:val="1F497D"/>
+          <w:sz w:val="20"/>
+          <w:szCs w:val="20"/>
+        </w:rPr>
+        <w:t>benefit["aoh"]["</w:t>
       </w:r>
       <w:r>
         <w:rPr>
@@ -8679,7 +9118,16 @@
           <w:sz w:val="20"/>
           <w:szCs w:val="20"/>
         </w:rPr>
-        <w:t>"]}}</w:t>
+        <w:t>"]</w:t>
+      </w:r>
+      <w:r>
+        <w:rPr>
+          <w:rFonts w:ascii="Poppins Light" w:eastAsia="Poppins Light" w:hAnsi="Poppins Light" w:cs="Poppins Light"/>
+          <w:color w:val="1F497D"/>
+          <w:sz w:val="20"/>
+          <w:szCs w:val="20"/>
+        </w:rPr>
+        <w:t>}}</w:t>
       </w:r>
       <w:r>
         <w:rPr>
@@ -9466,7 +9914,7 @@
 </file>
 
 <file path=word/endnotes.xml><?xml version="1.0" encoding="utf-8"?>
-<w:endnotes xmlns:wpc="http://schemas.microsoft.com/office/word/2010/wordprocessingCanvas" xmlns:cx="http://schemas.microsoft.com/office/drawing/2014/chartex" xmlns:cx1="http://schemas.microsoft.com/office/drawing/2015/9/8/chartex" xmlns:cx2="http://schemas.microsoft.com/office/drawing/2015/10/21/chartex" xmlns:cx3="http://schemas.microsoft.com/office/drawing/2016/5/9/chartex" xmlns:cx4="http://schemas.microsoft.com/office/drawing/2016/5/10/chartex" xmlns:cx5="http://schemas.microsoft.com/office/drawing/2016/5/11/chartex" xmlns:cx6="http://schemas.microsoft.com/office/drawing/2016/5/12/chartex" xmlns:cx7="http://schemas.microsoft.com/office/drawing/2016/5/13/chartex" xmlns:cx8="http://schemas.microsoft.com/office/drawing/2016/5/14/chartex" xmlns:mc="http://schemas.openxmlformats.org/markup-compatibility/2006" xmlns:aink="http://schemas.microsoft.com/office/drawing/2016/ink" xmlns:am3d="http://schemas.microsoft.com/office/drawing/2017/model3d" xmlns:o="urn:schemas-microsoft-com:office:office" xmlns:oel="http://schemas.microsoft.com/office/2019/extlst" xmlns:r="http://schemas.openxmlformats.org/officeDocument/2006/relationships" xmlns:m="http://schemas.openxmlformats.org/officeDocument/2006/math" xmlns:v="urn:schemas-microsoft-com:vml" xmlns:wp14="http://schemas.microsoft.com/office/word/2010/wordprocessingDrawing" xmlns:wp="http://schemas.openxmlformats.org/drawingml/2006/wordprocessingDrawing" xmlns:w10="urn:schemas-microsoft-com:office:word" xmlns:w="http://schemas.openxmlformats.org/wordprocessingml/2006/main" xmlns:w14="http://schemas.microsoft.com/office/word/2010/wordml" xmlns:w15="http://schemas.microsoft.com/office/word/2012/wordml" xmlns:w16cex="http://schemas.microsoft.com/office/word/2018/wordml/cex" xmlns:w16cid="http://schemas.microsoft.com/office/word/2016/wordml/cid" xmlns:w16="http://schemas.microsoft.com/office/word/2018/wordml" xmlns:w16du="http://schemas.microsoft.com/office/word/2023/wordml/word16du" xmlns:w16sdtdh="http://schemas.microsoft.com/office/word/2020/wordml/sdtdatahash" xmlns:w16sdtfl="http://schemas.microsoft.com/office/word/2024/wordml/sdtformatlock" xmlns:w16se="http://schemas.microsoft.com/office/word/2015/wordml/symex" xmlns:wpg="http://schemas.microsoft.com/office/word/2010/wordprocessingGroup" xmlns:wpi="http://schemas.microsoft.com/office/word/2010/wordprocessingInk" xmlns:wne="http://schemas.microsoft.com/office/word/2006/wordml" xmlns:wps="http://schemas.microsoft.com/office/word/2010/wordprocessingShape" mc:Ignorable="w14 w15 w16se w16cid w16 w16cex w16sdtdh w16sdtfl w16du wp14">
+<w:endnotes xmlns:wpc="http://schemas.microsoft.com/office/word/2010/wordprocessingCanvas" xmlns:cx="http://schemas.microsoft.com/office/drawing/2014/chartex" xmlns:cx1="http://schemas.microsoft.com/office/drawing/2015/9/8/chartex" xmlns:cx2="http://schemas.microsoft.com/office/drawing/2015/10/21/chartex" xmlns:cx3="http://schemas.microsoft.com/office/drawing/2016/5/9/chartex" xmlns:cx4="http://schemas.microsoft.com/office/drawing/2016/5/10/chartex" xmlns:cx5="http://schemas.microsoft.com/office/drawing/2016/5/11/chartex" xmlns:cx6="http://schemas.microsoft.com/office/drawing/2016/5/12/chartex" xmlns:cx7="http://schemas.microsoft.com/office/drawing/2016/5/13/chartex" xmlns:cx8="http://schemas.microsoft.com/office/drawing/2016/5/14/chartex" xmlns:mc="http://schemas.openxmlformats.org/markup-compatibility/2006" xmlns:aink="http://schemas.microsoft.com/office/drawing/2016/ink" xmlns:am3d="http://schemas.microsoft.com/office/drawing/2017/model3d" xmlns:o="urn:schemas-microsoft-com:office:office" xmlns:oel="http://schemas.microsoft.com/office/2019/extlst" xmlns:r="http://schemas.openxmlformats.org/officeDocument/2006/relationships" xmlns:m="http://schemas.openxmlformats.org/officeDocument/2006/math" xmlns:v="urn:schemas-microsoft-com:vml" xmlns:wp14="http://schemas.microsoft.com/office/word/2010/wordprocessingDrawing" xmlns:wp="http://schemas.openxmlformats.org/drawingml/2006/wordprocessingDrawing" xmlns:w10="urn:schemas-microsoft-com:office:word" xmlns:w="http://schemas.openxmlformats.org/wordprocessingml/2006/main" xmlns:w14="http://schemas.microsoft.com/office/word/2010/wordml" xmlns:w15="http://schemas.microsoft.com/office/word/2012/wordml" xmlns:w16cex="http://schemas.microsoft.com/office/word/2018/wordml/cex" xmlns:w16cid="http://schemas.microsoft.com/office/word/2016/wordml/cid" xmlns:w16="http://schemas.microsoft.com/office/word/2018/wordml" xmlns:w16sdtdh="http://schemas.microsoft.com/office/word/2020/wordml/sdtdatahash" xmlns:w16se="http://schemas.microsoft.com/office/word/2015/wordml/symex" xmlns:wpg="http://schemas.microsoft.com/office/word/2010/wordprocessingGroup" xmlns:wpi="http://schemas.microsoft.com/office/word/2010/wordprocessingInk" xmlns:wne="http://schemas.microsoft.com/office/word/2006/wordml" xmlns:wps="http://schemas.microsoft.com/office/word/2010/wordprocessingShape" mc:Ignorable="w14 w15 w16se w16cid w16 w16cex w16sdtdh wp14">
   <w:endnote w:type="separator" w:id="-1">
     <w:p>
       <w:pPr>
@@ -9491,7 +9939,7 @@
 </file>
 
 <file path=word/footer1.xml><?xml version="1.0" encoding="utf-8"?>
-<w:ftr xmlns:wpc="http://schemas.microsoft.com/office/word/2010/wordprocessingCanvas" xmlns:cx="http://schemas.microsoft.com/office/drawing/2014/chartex" xmlns:cx1="http://schemas.microsoft.com/office/drawing/2015/9/8/chartex" xmlns:cx2="http://schemas.microsoft.com/office/drawing/2015/10/21/chartex" xmlns:cx3="http://schemas.microsoft.com/office/drawing/2016/5/9/chartex" xmlns:cx4="http://schemas.microsoft.com/office/drawing/2016/5/10/chartex" xmlns:cx5="http://schemas.microsoft.com/office/drawing/2016/5/11/chartex" xmlns:cx6="http://schemas.microsoft.com/office/drawing/2016/5/12/chartex" xmlns:cx7="http://schemas.microsoft.com/office/drawing/2016/5/13/chartex" xmlns:cx8="http://schemas.microsoft.com/office/drawing/2016/5/14/chartex" xmlns:mc="http://schemas.openxmlformats.org/markup-compatibility/2006" xmlns:aink="http://schemas.microsoft.com/office/drawing/2016/ink" xmlns:am3d="http://schemas.microsoft.com/office/drawing/2017/model3d" xmlns:o="urn:schemas-microsoft-com:office:office" xmlns:oel="http://schemas.microsoft.com/office/2019/extlst" xmlns:r="http://schemas.openxmlformats.org/officeDocument/2006/relationships" xmlns:m="http://schemas.openxmlformats.org/officeDocument/2006/math" xmlns:v="urn:schemas-microsoft-com:vml" xmlns:wp14="http://schemas.microsoft.com/office/word/2010/wordprocessingDrawing" xmlns:wp="http://schemas.openxmlformats.org/drawingml/2006/wordprocessingDrawing" xmlns:w10="urn:schemas-microsoft-com:office:word" xmlns:w="http://schemas.openxmlformats.org/wordprocessingml/2006/main" xmlns:w14="http://schemas.microsoft.com/office/word/2010/wordml" xmlns:w15="http://schemas.microsoft.com/office/word/2012/wordml" xmlns:w16cex="http://schemas.microsoft.com/office/word/2018/wordml/cex" xmlns:w16cid="http://schemas.microsoft.com/office/word/2016/wordml/cid" xmlns:w16="http://schemas.microsoft.com/office/word/2018/wordml" xmlns:w16du="http://schemas.microsoft.com/office/word/2023/wordml/word16du" xmlns:w16sdtdh="http://schemas.microsoft.com/office/word/2020/wordml/sdtdatahash" xmlns:w16sdtfl="http://schemas.microsoft.com/office/word/2024/wordml/sdtformatlock" xmlns:w16se="http://schemas.microsoft.com/office/word/2015/wordml/symex" xmlns:wpg="http://schemas.microsoft.com/office/word/2010/wordprocessingGroup" xmlns:wpi="http://schemas.microsoft.com/office/word/2010/wordprocessingInk" xmlns:wne="http://schemas.microsoft.com/office/word/2006/wordml" xmlns:wps="http://schemas.microsoft.com/office/word/2010/wordprocessingShape" mc:Ignorable="w14 w15 w16se w16cid w16 w16cex w16sdtdh w16sdtfl w16du wp14">
+<w:ftr xmlns:wpc="http://schemas.microsoft.com/office/word/2010/wordprocessingCanvas" xmlns:cx="http://schemas.microsoft.com/office/drawing/2014/chartex" xmlns:cx1="http://schemas.microsoft.com/office/drawing/2015/9/8/chartex" xmlns:cx2="http://schemas.microsoft.com/office/drawing/2015/10/21/chartex" xmlns:cx3="http://schemas.microsoft.com/office/drawing/2016/5/9/chartex" xmlns:cx4="http://schemas.microsoft.com/office/drawing/2016/5/10/chartex" xmlns:cx5="http://schemas.microsoft.com/office/drawing/2016/5/11/chartex" xmlns:cx6="http://schemas.microsoft.com/office/drawing/2016/5/12/chartex" xmlns:cx7="http://schemas.microsoft.com/office/drawing/2016/5/13/chartex" xmlns:cx8="http://schemas.microsoft.com/office/drawing/2016/5/14/chartex" xmlns:mc="http://schemas.openxmlformats.org/markup-compatibility/2006" xmlns:aink="http://schemas.microsoft.com/office/drawing/2016/ink" xmlns:am3d="http://schemas.microsoft.com/office/drawing/2017/model3d" xmlns:o="urn:schemas-microsoft-com:office:office" xmlns:oel="http://schemas.microsoft.com/office/2019/extlst" xmlns:r="http://schemas.openxmlformats.org/officeDocument/2006/relationships" xmlns:m="http://schemas.openxmlformats.org/officeDocument/2006/math" xmlns:v="urn:schemas-microsoft-com:vml" xmlns:wp14="http://schemas.microsoft.com/office/word/2010/wordprocessingDrawing" xmlns:wp="http://schemas.openxmlformats.org/drawingml/2006/wordprocessingDrawing" xmlns:w10="urn:schemas-microsoft-com:office:word" xmlns:w="http://schemas.openxmlformats.org/wordprocessingml/2006/main" xmlns:w14="http://schemas.microsoft.com/office/word/2010/wordml" xmlns:w15="http://schemas.microsoft.com/office/word/2012/wordml" xmlns:w16cex="http://schemas.microsoft.com/office/word/2018/wordml/cex" xmlns:w16cid="http://schemas.microsoft.com/office/word/2016/wordml/cid" xmlns:w16="http://schemas.microsoft.com/office/word/2018/wordml" xmlns:w16sdtdh="http://schemas.microsoft.com/office/word/2020/wordml/sdtdatahash" xmlns:w16se="http://schemas.microsoft.com/office/word/2015/wordml/symex" xmlns:wpg="http://schemas.microsoft.com/office/word/2010/wordprocessingGroup" xmlns:wpi="http://schemas.microsoft.com/office/word/2010/wordprocessingInk" xmlns:wne="http://schemas.microsoft.com/office/word/2006/wordml" xmlns:wps="http://schemas.microsoft.com/office/word/2010/wordprocessingShape" mc:Ignorable="w14 w15 w16se w16cid w16 w16cex w16sdtdh wp14">
   <w:p>
     <w:pPr>
       <w:pStyle w:val="Footer"/>
@@ -9501,7 +9949,7 @@
 </file>
 
 <file path=word/footer2.xml><?xml version="1.0" encoding="utf-8"?>
-<w:ftr xmlns:wpc="http://schemas.microsoft.com/office/word/2010/wordprocessingCanvas" xmlns:cx="http://schemas.microsoft.com/office/drawing/2014/chartex" xmlns:cx1="http://schemas.microsoft.com/office/drawing/2015/9/8/chartex" xmlns:cx2="http://schemas.microsoft.com/office/drawing/2015/10/21/chartex" xmlns:cx3="http://schemas.microsoft.com/office/drawing/2016/5/9/chartex" xmlns:cx4="http://schemas.microsoft.com/office/drawing/2016/5/10/chartex" xmlns:cx5="http://schemas.microsoft.com/office/drawing/2016/5/11/chartex" xmlns:cx6="http://schemas.microsoft.com/office/drawing/2016/5/12/chartex" xmlns:cx7="http://schemas.microsoft.com/office/drawing/2016/5/13/chartex" xmlns:cx8="http://schemas.microsoft.com/office/drawing/2016/5/14/chartex" xmlns:mc="http://schemas.openxmlformats.org/markup-compatibility/2006" xmlns:aink="http://schemas.microsoft.com/office/drawing/2016/ink" xmlns:am3d="http://schemas.microsoft.com/office/drawing/2017/model3d" xmlns:o="urn:schemas-microsoft-com:office:office" xmlns:oel="http://schemas.microsoft.com/office/2019/extlst" xmlns:r="http://schemas.openxmlformats.org/officeDocument/2006/relationships" xmlns:m="http://schemas.openxmlformats.org/officeDocument/2006/math" xmlns:v="urn:schemas-microsoft-com:vml" xmlns:wp14="http://schemas.microsoft.com/office/word/2010/wordprocessingDrawing" xmlns:wp="http://schemas.openxmlformats.org/drawingml/2006/wordprocessingDrawing" xmlns:w10="urn:schemas-microsoft-com:office:word" xmlns:w="http://schemas.openxmlformats.org/wordprocessingml/2006/main" xmlns:w14="http://schemas.microsoft.com/office/word/2010/wordml" xmlns:w15="http://schemas.microsoft.com/office/word/2012/wordml" xmlns:w16cex="http://schemas.microsoft.com/office/word/2018/wordml/cex" xmlns:w16cid="http://schemas.microsoft.com/office/word/2016/wordml/cid" xmlns:w16="http://schemas.microsoft.com/office/word/2018/wordml" xmlns:w16du="http://schemas.microsoft.com/office/word/2023/wordml/word16du" xmlns:w16sdtdh="http://schemas.microsoft.com/office/word/2020/wordml/sdtdatahash" xmlns:w16sdtfl="http://schemas.microsoft.com/office/word/2024/wordml/sdtformatlock" xmlns:w16se="http://schemas.microsoft.com/office/word/2015/wordml/symex" xmlns:wpg="http://schemas.microsoft.com/office/word/2010/wordprocessingGroup" xmlns:wpi="http://schemas.microsoft.com/office/word/2010/wordprocessingInk" xmlns:wne="http://schemas.microsoft.com/office/word/2006/wordml" xmlns:wps="http://schemas.microsoft.com/office/word/2010/wordprocessingShape" mc:Ignorable="w14 w15 w16se w16cid w16 w16cex w16sdtdh w16sdtfl w16du wp14">
+<w:ftr xmlns:wpc="http://schemas.microsoft.com/office/word/2010/wordprocessingCanvas" xmlns:cx="http://schemas.microsoft.com/office/drawing/2014/chartex" xmlns:cx1="http://schemas.microsoft.com/office/drawing/2015/9/8/chartex" xmlns:cx2="http://schemas.microsoft.com/office/drawing/2015/10/21/chartex" xmlns:cx3="http://schemas.microsoft.com/office/drawing/2016/5/9/chartex" xmlns:cx4="http://schemas.microsoft.com/office/drawing/2016/5/10/chartex" xmlns:cx5="http://schemas.microsoft.com/office/drawing/2016/5/11/chartex" xmlns:cx6="http://schemas.microsoft.com/office/drawing/2016/5/12/chartex" xmlns:cx7="http://schemas.microsoft.com/office/drawing/2016/5/13/chartex" xmlns:cx8="http://schemas.microsoft.com/office/drawing/2016/5/14/chartex" xmlns:mc="http://schemas.openxmlformats.org/markup-compatibility/2006" xmlns:aink="http://schemas.microsoft.com/office/drawing/2016/ink" xmlns:am3d="http://schemas.microsoft.com/office/drawing/2017/model3d" xmlns:o="urn:schemas-microsoft-com:office:office" xmlns:oel="http://schemas.microsoft.com/office/2019/extlst" xmlns:r="http://schemas.openxmlformats.org/officeDocument/2006/relationships" xmlns:m="http://schemas.openxmlformats.org/officeDocument/2006/math" xmlns:v="urn:schemas-microsoft-com:vml" xmlns:wp14="http://schemas.microsoft.com/office/word/2010/wordprocessingDrawing" xmlns:wp="http://schemas.openxmlformats.org/drawingml/2006/wordprocessingDrawing" xmlns:w10="urn:schemas-microsoft-com:office:word" xmlns:w="http://schemas.openxmlformats.org/wordprocessingml/2006/main" xmlns:w14="http://schemas.microsoft.com/office/word/2010/wordml" xmlns:w15="http://schemas.microsoft.com/office/word/2012/wordml" xmlns:w16cex="http://schemas.microsoft.com/office/word/2018/wordml/cex" xmlns:w16cid="http://schemas.microsoft.com/office/word/2016/wordml/cid" xmlns:w16="http://schemas.microsoft.com/office/word/2018/wordml" xmlns:w16sdtdh="http://schemas.microsoft.com/office/word/2020/wordml/sdtdatahash" xmlns:w16se="http://schemas.microsoft.com/office/word/2015/wordml/symex" xmlns:wpg="http://schemas.microsoft.com/office/word/2010/wordprocessingGroup" xmlns:wpi="http://schemas.microsoft.com/office/word/2010/wordprocessingInk" xmlns:wne="http://schemas.microsoft.com/office/word/2006/wordml" xmlns:wps="http://schemas.microsoft.com/office/word/2010/wordprocessingShape" mc:Ignorable="w14 w15 w16se w16cid w16 w16cex w16sdtdh wp14">
   <w:p>
     <w:pPr>
       <w:jc w:val="center"/>
@@ -9537,13 +9985,13 @@
 </file>
 
 <file path=word/footer3.xml><?xml version="1.0" encoding="utf-8"?>
-<w:ftr xmlns:wpc="http://schemas.microsoft.com/office/word/2010/wordprocessingCanvas" xmlns:cx="http://schemas.microsoft.com/office/drawing/2014/chartex" xmlns:cx1="http://schemas.microsoft.com/office/drawing/2015/9/8/chartex" xmlns:cx2="http://schemas.microsoft.com/office/drawing/2015/10/21/chartex" xmlns:cx3="http://schemas.microsoft.com/office/drawing/2016/5/9/chartex" xmlns:cx4="http://schemas.microsoft.com/office/drawing/2016/5/10/chartex" xmlns:cx5="http://schemas.microsoft.com/office/drawing/2016/5/11/chartex" xmlns:cx6="http://schemas.microsoft.com/office/drawing/2016/5/12/chartex" xmlns:cx7="http://schemas.microsoft.com/office/drawing/2016/5/13/chartex" xmlns:cx8="http://schemas.microsoft.com/office/drawing/2016/5/14/chartex" xmlns:mc="http://schemas.openxmlformats.org/markup-compatibility/2006" xmlns:aink="http://schemas.microsoft.com/office/drawing/2016/ink" xmlns:am3d="http://schemas.microsoft.com/office/drawing/2017/model3d" xmlns:o="urn:schemas-microsoft-com:office:office" xmlns:oel="http://schemas.microsoft.com/office/2019/extlst" xmlns:r="http://schemas.openxmlformats.org/officeDocument/2006/relationships" xmlns:m="http://schemas.openxmlformats.org/officeDocument/2006/math" xmlns:v="urn:schemas-microsoft-com:vml" xmlns:wp14="http://schemas.microsoft.com/office/word/2010/wordprocessingDrawing" xmlns:wp="http://schemas.openxmlformats.org/drawingml/2006/wordprocessingDrawing" xmlns:w10="urn:schemas-microsoft-com:office:word" xmlns:w="http://schemas.openxmlformats.org/wordprocessingml/2006/main" xmlns:w14="http://schemas.microsoft.com/office/word/2010/wordml" xmlns:w15="http://schemas.microsoft.com/office/word/2012/wordml" xmlns:w16cex="http://schemas.microsoft.com/office/word/2018/wordml/cex" xmlns:w16cid="http://schemas.microsoft.com/office/word/2016/wordml/cid" xmlns:w16="http://schemas.microsoft.com/office/word/2018/wordml" xmlns:w16du="http://schemas.microsoft.com/office/word/2023/wordml/word16du" xmlns:w16sdtdh="http://schemas.microsoft.com/office/word/2020/wordml/sdtdatahash" xmlns:w16sdtfl="http://schemas.microsoft.com/office/word/2024/wordml/sdtformatlock" xmlns:w16se="http://schemas.microsoft.com/office/word/2015/wordml/symex" xmlns:wpg="http://schemas.microsoft.com/office/word/2010/wordprocessingGroup" xmlns:wpi="http://schemas.microsoft.com/office/word/2010/wordprocessingInk" xmlns:wne="http://schemas.microsoft.com/office/word/2006/wordml" xmlns:wps="http://schemas.microsoft.com/office/word/2010/wordprocessingShape" mc:Ignorable="w14 w15 w16se w16cid w16 w16cex w16sdtdh w16sdtfl w16du wp14">
+<w:ftr xmlns:wpc="http://schemas.microsoft.com/office/word/2010/wordprocessingCanvas" xmlns:cx="http://schemas.microsoft.com/office/drawing/2014/chartex" xmlns:cx1="http://schemas.microsoft.com/office/drawing/2015/9/8/chartex" xmlns:cx2="http://schemas.microsoft.com/office/drawing/2015/10/21/chartex" xmlns:cx3="http://schemas.microsoft.com/office/drawing/2016/5/9/chartex" xmlns:cx4="http://schemas.microsoft.com/office/drawing/2016/5/10/chartex" xmlns:cx5="http://schemas.microsoft.com/office/drawing/2016/5/11/chartex" xmlns:cx6="http://schemas.microsoft.com/office/drawing/2016/5/12/chartex" xmlns:cx7="http://schemas.microsoft.com/office/drawing/2016/5/13/chartex" xmlns:cx8="http://schemas.microsoft.com/office/drawing/2016/5/14/chartex" xmlns:mc="http://schemas.openxmlformats.org/markup-compatibility/2006" xmlns:aink="http://schemas.microsoft.com/office/drawing/2016/ink" xmlns:am3d="http://schemas.microsoft.com/office/drawing/2017/model3d" xmlns:o="urn:schemas-microsoft-com:office:office" xmlns:oel="http://schemas.microsoft.com/office/2019/extlst" xmlns:r="http://schemas.openxmlformats.org/officeDocument/2006/relationships" xmlns:m="http://schemas.openxmlformats.org/officeDocument/2006/math" xmlns:v="urn:schemas-microsoft-com:vml" xmlns:wp14="http://schemas.microsoft.com/office/word/2010/wordprocessingDrawing" xmlns:wp="http://schemas.openxmlformats.org/drawingml/2006/wordprocessingDrawing" xmlns:w10="urn:schemas-microsoft-com:office:word" xmlns:w="http://schemas.openxmlformats.org/wordprocessingml/2006/main" xmlns:w14="http://schemas.microsoft.com/office/word/2010/wordml" xmlns:w15="http://schemas.microsoft.com/office/word/2012/wordml" xmlns:w16cex="http://schemas.microsoft.com/office/word/2018/wordml/cex" xmlns:w16cid="http://schemas.microsoft.com/office/word/2016/wordml/cid" xmlns:w16="http://schemas.microsoft.com/office/word/2018/wordml" xmlns:w16sdtdh="http://schemas.microsoft.com/office/word/2020/wordml/sdtdatahash" xmlns:w16se="http://schemas.microsoft.com/office/word/2015/wordml/symex" xmlns:wpg="http://schemas.microsoft.com/office/word/2010/wordprocessingGroup" xmlns:wpi="http://schemas.microsoft.com/office/word/2010/wordprocessingInk" xmlns:wne="http://schemas.microsoft.com/office/word/2006/wordml" xmlns:wps="http://schemas.microsoft.com/office/word/2010/wordprocessingShape" mc:Ignorable="w14 w15 w16se w16cid w16 w16cex w16sdtdh wp14">
   <w:p/>
 </w:ftr>
 </file>
 
 <file path=word/footnotes.xml><?xml version="1.0" encoding="utf-8"?>
-<w:footnotes xmlns:wpc="http://schemas.microsoft.com/office/word/2010/wordprocessingCanvas" xmlns:cx="http://schemas.microsoft.com/office/drawing/2014/chartex" xmlns:cx1="http://schemas.microsoft.com/office/drawing/2015/9/8/chartex" xmlns:cx2="http://schemas.microsoft.com/office/drawing/2015/10/21/chartex" xmlns:cx3="http://schemas.microsoft.com/office/drawing/2016/5/9/chartex" xmlns:cx4="http://schemas.microsoft.com/office/drawing/2016/5/10/chartex" xmlns:cx5="http://schemas.microsoft.com/office/drawing/2016/5/11/chartex" xmlns:cx6="http://schemas.microsoft.com/office/drawing/2016/5/12/chartex" xmlns:cx7="http://schemas.microsoft.com/office/drawing/2016/5/13/chartex" xmlns:cx8="http://schemas.microsoft.com/office/drawing/2016/5/14/chartex" xmlns:mc="http://schemas.openxmlformats.org/markup-compatibility/2006" xmlns:aink="http://schemas.microsoft.com/office/drawing/2016/ink" xmlns:am3d="http://schemas.microsoft.com/office/drawing/2017/model3d" xmlns:o="urn:schemas-microsoft-com:office:office" xmlns:oel="http://schemas.microsoft.com/office/2019/extlst" xmlns:r="http://schemas.openxmlformats.org/officeDocument/2006/relationships" xmlns:m="http://schemas.openxmlformats.org/officeDocument/2006/math" xmlns:v="urn:schemas-microsoft-com:vml" xmlns:wp14="http://schemas.microsoft.com/office/word/2010/wordprocessingDrawing" xmlns:wp="http://schemas.openxmlformats.org/drawingml/2006/wordprocessingDrawing" xmlns:w10="urn:schemas-microsoft-com:office:word" xmlns:w="http://schemas.openxmlformats.org/wordprocessingml/2006/main" xmlns:w14="http://schemas.microsoft.com/office/word/2010/wordml" xmlns:w15="http://schemas.microsoft.com/office/word/2012/wordml" xmlns:w16cex="http://schemas.microsoft.com/office/word/2018/wordml/cex" xmlns:w16cid="http://schemas.microsoft.com/office/word/2016/wordml/cid" xmlns:w16="http://schemas.microsoft.com/office/word/2018/wordml" xmlns:w16du="http://schemas.microsoft.com/office/word/2023/wordml/word16du" xmlns:w16sdtdh="http://schemas.microsoft.com/office/word/2020/wordml/sdtdatahash" xmlns:w16sdtfl="http://schemas.microsoft.com/office/word/2024/wordml/sdtformatlock" xmlns:w16se="http://schemas.microsoft.com/office/word/2015/wordml/symex" xmlns:wpg="http://schemas.microsoft.com/office/word/2010/wordprocessingGroup" xmlns:wpi="http://schemas.microsoft.com/office/word/2010/wordprocessingInk" xmlns:wne="http://schemas.microsoft.com/office/word/2006/wordml" xmlns:wps="http://schemas.microsoft.com/office/word/2010/wordprocessingShape" mc:Ignorable="w14 w15 w16se w16cid w16 w16cex w16sdtdh w16sdtfl w16du wp14">
+<w:footnotes xmlns:wpc="http://schemas.microsoft.com/office/word/2010/wordprocessingCanvas" xmlns:cx="http://schemas.microsoft.com/office/drawing/2014/chartex" xmlns:cx1="http://schemas.microsoft.com/office/drawing/2015/9/8/chartex" xmlns:cx2="http://schemas.microsoft.com/office/drawing/2015/10/21/chartex" xmlns:cx3="http://schemas.microsoft.com/office/drawing/2016/5/9/chartex" xmlns:cx4="http://schemas.microsoft.com/office/drawing/2016/5/10/chartex" xmlns:cx5="http://schemas.microsoft.com/office/drawing/2016/5/11/chartex" xmlns:cx6="http://schemas.microsoft.com/office/drawing/2016/5/12/chartex" xmlns:cx7="http://schemas.microsoft.com/office/drawing/2016/5/13/chartex" xmlns:cx8="http://schemas.microsoft.com/office/drawing/2016/5/14/chartex" xmlns:mc="http://schemas.openxmlformats.org/markup-compatibility/2006" xmlns:aink="http://schemas.microsoft.com/office/drawing/2016/ink" xmlns:am3d="http://schemas.microsoft.com/office/drawing/2017/model3d" xmlns:o="urn:schemas-microsoft-com:office:office" xmlns:oel="http://schemas.microsoft.com/office/2019/extlst" xmlns:r="http://schemas.openxmlformats.org/officeDocument/2006/relationships" xmlns:m="http://schemas.openxmlformats.org/officeDocument/2006/math" xmlns:v="urn:schemas-microsoft-com:vml" xmlns:wp14="http://schemas.microsoft.com/office/word/2010/wordprocessingDrawing" xmlns:wp="http://schemas.openxmlformats.org/drawingml/2006/wordprocessingDrawing" xmlns:w10="urn:schemas-microsoft-com:office:word" xmlns:w="http://schemas.openxmlformats.org/wordprocessingml/2006/main" xmlns:w14="http://schemas.microsoft.com/office/word/2010/wordml" xmlns:w15="http://schemas.microsoft.com/office/word/2012/wordml" xmlns:w16cex="http://schemas.microsoft.com/office/word/2018/wordml/cex" xmlns:w16cid="http://schemas.microsoft.com/office/word/2016/wordml/cid" xmlns:w16="http://schemas.microsoft.com/office/word/2018/wordml" xmlns:w16sdtdh="http://schemas.microsoft.com/office/word/2020/wordml/sdtdatahash" xmlns:w16se="http://schemas.microsoft.com/office/word/2015/wordml/symex" xmlns:wpg="http://schemas.microsoft.com/office/word/2010/wordprocessingGroup" xmlns:wpi="http://schemas.microsoft.com/office/word/2010/wordprocessingInk" xmlns:wne="http://schemas.microsoft.com/office/word/2006/wordml" xmlns:wps="http://schemas.microsoft.com/office/word/2010/wordprocessingShape" mc:Ignorable="w14 w15 w16se w16cid w16 w16cex w16sdtdh wp14">
   <w:footnote w:type="separator" w:id="-1">
     <w:p>
       <w:pPr>
@@ -9725,7 +10173,15 @@
           <w:sz w:val="16"/>
           <w:szCs w:val="16"/>
         </w:rPr>
-        <w:t xml:space="preserve"> Based on the probability risks of deforestation model using ‘forestatrisks’ python package, incorporating several explanatory variables such as elevation, slope, distance from forest edge, distance from previous deforestation, distance from settlements area, distance from roads, distance from river, and the presence of protected areas.</w:t>
+        <w:t xml:space="preserve"> </w:t>
+      </w:r>
+      <w:r>
+        <w:rPr>
+          <w:rFonts w:ascii="Poppins Light" w:eastAsia="Poppins Light" w:hAnsi="Poppins Light" w:cs="Poppins Light"/>
+          <w:sz w:val="16"/>
+          <w:szCs w:val="16"/>
+        </w:rPr>
+        <w:t>Based on the probability risks of deforestation model using ‘forestatrisks’ python package, incorporating several explanatory variables such as elevation, slope, distance from forest edge, distance from previous deforestation, distance from settlements area, distance from roads, distance from river, and the presence of protected areas.</w:t>
       </w:r>
     </w:p>
   </w:footnote>
@@ -9751,7 +10207,15 @@
           <w:sz w:val="16"/>
           <w:szCs w:val="16"/>
         </w:rPr>
-        <w:t xml:space="preserve"> Grantham et al. (2020)</w:t>
+        <w:t xml:space="preserve"> </w:t>
+      </w:r>
+      <w:r>
+        <w:rPr>
+          <w:rFonts w:ascii="Poppins Light" w:eastAsia="Poppins Light" w:hAnsi="Poppins Light" w:cs="Poppins Light"/>
+          <w:sz w:val="16"/>
+          <w:szCs w:val="16"/>
+        </w:rPr>
+        <w:t>Grantham et al. (2020)</w:t>
       </w:r>
     </w:p>
   </w:footnote>
@@ -9777,7 +10241,15 @@
           <w:sz w:val="16"/>
           <w:szCs w:val="16"/>
         </w:rPr>
-        <w:t xml:space="preserve"> Based on the area of habitat from IUCN threatened (vulnerable, critically endangered, and endangered) wildlife species data.</w:t>
+        <w:t xml:space="preserve"> </w:t>
+      </w:r>
+      <w:r>
+        <w:rPr>
+          <w:rFonts w:ascii="Poppins Light" w:eastAsia="Poppins Light" w:hAnsi="Poppins Light" w:cs="Poppins Light"/>
+          <w:sz w:val="16"/>
+          <w:szCs w:val="16"/>
+        </w:rPr>
+        <w:t>Based on the area of habitat from IUCN threatened (vulnerable, critically endangered, and endangered) wildlife species data.</w:t>
       </w:r>
     </w:p>
   </w:footnote>
@@ -9803,7 +10275,15 @@
           <w:sz w:val="16"/>
           <w:szCs w:val="16"/>
         </w:rPr>
-        <w:t xml:space="preserve"> Data on tree species richness indicates the diversity of tree species within a specific region (Gaisberger et al. 2022)</w:t>
+        <w:t xml:space="preserve"> </w:t>
+      </w:r>
+      <w:r>
+        <w:rPr>
+          <w:rFonts w:ascii="Poppins Light" w:eastAsia="Poppins Light" w:hAnsi="Poppins Light" w:cs="Poppins Light"/>
+          <w:sz w:val="16"/>
+          <w:szCs w:val="16"/>
+        </w:rPr>
+        <w:t>Data on tree species richness indicates the diversity of tree species within a specific region (Gaisberger et al. 2022)</w:t>
       </w:r>
     </w:p>
   </w:footnote>
@@ -9829,7 +10309,15 @@
           <w:sz w:val="16"/>
           <w:szCs w:val="16"/>
         </w:rPr>
-        <w:t xml:space="preserve"> These data define Tiger Conservation Landscapes (TCLs), large areas suitable for tigers. TCLs encompass three main categories: species landscapes, confirmed tiger presence within the last five years; survey landscapes, where tiger status is uncertain; and restoration landscapes, where tigers have disappeared (Sanderson et al. 2023).</w:t>
+        <w:t xml:space="preserve"> </w:t>
+      </w:r>
+      <w:r>
+        <w:rPr>
+          <w:rFonts w:ascii="Poppins Light" w:eastAsia="Poppins Light" w:hAnsi="Poppins Light" w:cs="Poppins Light"/>
+          <w:sz w:val="16"/>
+          <w:szCs w:val="16"/>
+        </w:rPr>
+        <w:t>These data define Tiger Conservation Landscapes (TCLs), large areas suitable for tigers. TCLs encompass three main categories: species landscapes, confirmed tiger presence within the last five years; survey landscapes, where tiger status is uncertain; and restoration landscapes, where tigers have disappeared (Sanderson et al. 2023).</w:t>
       </w:r>
     </w:p>
   </w:footnote>
@@ -9978,7 +10466,7 @@
 </file>
 
 <file path=word/header1.xml><?xml version="1.0" encoding="utf-8"?>
-<w:hdr xmlns:wpc="http://schemas.microsoft.com/office/word/2010/wordprocessingCanvas" xmlns:cx="http://schemas.microsoft.com/office/drawing/2014/chartex" xmlns:cx1="http://schemas.microsoft.com/office/drawing/2015/9/8/chartex" xmlns:cx2="http://schemas.microsoft.com/office/drawing/2015/10/21/chartex" xmlns:cx3="http://schemas.microsoft.com/office/drawing/2016/5/9/chartex" xmlns:cx4="http://schemas.microsoft.com/office/drawing/2016/5/10/chartex" xmlns:cx5="http://schemas.microsoft.com/office/drawing/2016/5/11/chartex" xmlns:cx6="http://schemas.microsoft.com/office/drawing/2016/5/12/chartex" xmlns:cx7="http://schemas.microsoft.com/office/drawing/2016/5/13/chartex" xmlns:cx8="http://schemas.microsoft.com/office/drawing/2016/5/14/chartex" xmlns:mc="http://schemas.openxmlformats.org/markup-compatibility/2006" xmlns:aink="http://schemas.microsoft.com/office/drawing/2016/ink" xmlns:am3d="http://schemas.microsoft.com/office/drawing/2017/model3d" xmlns:o="urn:schemas-microsoft-com:office:office" xmlns:oel="http://schemas.microsoft.com/office/2019/extlst" xmlns:r="http://schemas.openxmlformats.org/officeDocument/2006/relationships" xmlns:m="http://schemas.openxmlformats.org/officeDocument/2006/math" xmlns:v="urn:schemas-microsoft-com:vml" xmlns:wp14="http://schemas.microsoft.com/office/word/2010/wordprocessingDrawing" xmlns:wp="http://schemas.openxmlformats.org/drawingml/2006/wordprocessingDrawing" xmlns:w10="urn:schemas-microsoft-com:office:word" xmlns:w="http://schemas.openxmlformats.org/wordprocessingml/2006/main" xmlns:w14="http://schemas.microsoft.com/office/word/2010/wordml" xmlns:w15="http://schemas.microsoft.com/office/word/2012/wordml" xmlns:w16cex="http://schemas.microsoft.com/office/word/2018/wordml/cex" xmlns:w16cid="http://schemas.microsoft.com/office/word/2016/wordml/cid" xmlns:w16="http://schemas.microsoft.com/office/word/2018/wordml" xmlns:w16du="http://schemas.microsoft.com/office/word/2023/wordml/word16du" xmlns:w16sdtdh="http://schemas.microsoft.com/office/word/2020/wordml/sdtdatahash" xmlns:w16sdtfl="http://schemas.microsoft.com/office/word/2024/wordml/sdtformatlock" xmlns:w16se="http://schemas.microsoft.com/office/word/2015/wordml/symex" xmlns:wpg="http://schemas.microsoft.com/office/word/2010/wordprocessingGroup" xmlns:wpi="http://schemas.microsoft.com/office/word/2010/wordprocessingInk" xmlns:wne="http://schemas.microsoft.com/office/word/2006/wordml" xmlns:wps="http://schemas.microsoft.com/office/word/2010/wordprocessingShape" mc:Ignorable="w14 w15 w16se w16cid w16 w16cex w16sdtdh w16sdtfl w16du wp14">
+<w:hdr xmlns:wpc="http://schemas.microsoft.com/office/word/2010/wordprocessingCanvas" xmlns:cx="http://schemas.microsoft.com/office/drawing/2014/chartex" xmlns:cx1="http://schemas.microsoft.com/office/drawing/2015/9/8/chartex" xmlns:cx2="http://schemas.microsoft.com/office/drawing/2015/10/21/chartex" xmlns:cx3="http://schemas.microsoft.com/office/drawing/2016/5/9/chartex" xmlns:cx4="http://schemas.microsoft.com/office/drawing/2016/5/10/chartex" xmlns:cx5="http://schemas.microsoft.com/office/drawing/2016/5/11/chartex" xmlns:cx6="http://schemas.microsoft.com/office/drawing/2016/5/12/chartex" xmlns:cx7="http://schemas.microsoft.com/office/drawing/2016/5/13/chartex" xmlns:cx8="http://schemas.microsoft.com/office/drawing/2016/5/14/chartex" xmlns:mc="http://schemas.openxmlformats.org/markup-compatibility/2006" xmlns:aink="http://schemas.microsoft.com/office/drawing/2016/ink" xmlns:am3d="http://schemas.microsoft.com/office/drawing/2017/model3d" xmlns:o="urn:schemas-microsoft-com:office:office" xmlns:oel="http://schemas.microsoft.com/office/2019/extlst" xmlns:r="http://schemas.openxmlformats.org/officeDocument/2006/relationships" xmlns:m="http://schemas.openxmlformats.org/officeDocument/2006/math" xmlns:v="urn:schemas-microsoft-com:vml" xmlns:wp14="http://schemas.microsoft.com/office/word/2010/wordprocessingDrawing" xmlns:wp="http://schemas.openxmlformats.org/drawingml/2006/wordprocessingDrawing" xmlns:w10="urn:schemas-microsoft-com:office:word" xmlns:w="http://schemas.openxmlformats.org/wordprocessingml/2006/main" xmlns:w14="http://schemas.microsoft.com/office/word/2010/wordml" xmlns:w15="http://schemas.microsoft.com/office/word/2012/wordml" xmlns:w16cex="http://schemas.microsoft.com/office/word/2018/wordml/cex" xmlns:w16cid="http://schemas.microsoft.com/office/word/2016/wordml/cid" xmlns:w16="http://schemas.microsoft.com/office/word/2018/wordml" xmlns:w16sdtdh="http://schemas.microsoft.com/office/word/2020/wordml/sdtdatahash" xmlns:w16se="http://schemas.microsoft.com/office/word/2015/wordml/symex" xmlns:wpg="http://schemas.microsoft.com/office/word/2010/wordprocessingGroup" xmlns:wpi="http://schemas.microsoft.com/office/word/2010/wordprocessingInk" xmlns:wne="http://schemas.microsoft.com/office/word/2006/wordml" xmlns:wps="http://schemas.microsoft.com/office/word/2010/wordprocessingShape" mc:Ignorable="w14 w15 w16se w16cid w16 w16cex w16sdtdh wp14">
   <w:p>
     <w:pPr>
       <w:pStyle w:val="Header"/>
@@ -9988,7 +10476,7 @@
 </file>
 
 <file path=word/header2.xml><?xml version="1.0" encoding="utf-8"?>
-<w:hdr xmlns:wpc="http://schemas.microsoft.com/office/word/2010/wordprocessingCanvas" xmlns:cx="http://schemas.microsoft.com/office/drawing/2014/chartex" xmlns:cx1="http://schemas.microsoft.com/office/drawing/2015/9/8/chartex" xmlns:cx2="http://schemas.microsoft.com/office/drawing/2015/10/21/chartex" xmlns:cx3="http://schemas.microsoft.com/office/drawing/2016/5/9/chartex" xmlns:cx4="http://schemas.microsoft.com/office/drawing/2016/5/10/chartex" xmlns:cx5="http://schemas.microsoft.com/office/drawing/2016/5/11/chartex" xmlns:cx6="http://schemas.microsoft.com/office/drawing/2016/5/12/chartex" xmlns:cx7="http://schemas.microsoft.com/office/drawing/2016/5/13/chartex" xmlns:cx8="http://schemas.microsoft.com/office/drawing/2016/5/14/chartex" xmlns:mc="http://schemas.openxmlformats.org/markup-compatibility/2006" xmlns:aink="http://schemas.microsoft.com/office/drawing/2016/ink" xmlns:am3d="http://schemas.microsoft.com/office/drawing/2017/model3d" xmlns:o="urn:schemas-microsoft-com:office:office" xmlns:oel="http://schemas.microsoft.com/office/2019/extlst" xmlns:r="http://schemas.openxmlformats.org/officeDocument/2006/relationships" xmlns:m="http://schemas.openxmlformats.org/officeDocument/2006/math" xmlns:v="urn:schemas-microsoft-com:vml" xmlns:wp14="http://schemas.microsoft.com/office/word/2010/wordprocessingDrawing" xmlns:wp="http://schemas.openxmlformats.org/drawingml/2006/wordprocessingDrawing" xmlns:w10="urn:schemas-microsoft-com:office:word" xmlns:w="http://schemas.openxmlformats.org/wordprocessingml/2006/main" xmlns:w14="http://schemas.microsoft.com/office/word/2010/wordml" xmlns:w15="http://schemas.microsoft.com/office/word/2012/wordml" xmlns:w16cex="http://schemas.microsoft.com/office/word/2018/wordml/cex" xmlns:w16cid="http://schemas.microsoft.com/office/word/2016/wordml/cid" xmlns:w16="http://schemas.microsoft.com/office/word/2018/wordml" xmlns:w16du="http://schemas.microsoft.com/office/word/2023/wordml/word16du" xmlns:w16sdtdh="http://schemas.microsoft.com/office/word/2020/wordml/sdtdatahash" xmlns:w16sdtfl="http://schemas.microsoft.com/office/word/2024/wordml/sdtformatlock" xmlns:w16se="http://schemas.microsoft.com/office/word/2015/wordml/symex" xmlns:wpg="http://schemas.microsoft.com/office/word/2010/wordprocessingGroup" xmlns:wpi="http://schemas.microsoft.com/office/word/2010/wordprocessingInk" xmlns:wne="http://schemas.microsoft.com/office/word/2006/wordml" xmlns:wps="http://schemas.microsoft.com/office/word/2010/wordprocessingShape" mc:Ignorable="w14 w15 w16se w16cid w16 w16cex w16sdtdh w16sdtfl w16du wp14">
+<w:hdr xmlns:wpc="http://schemas.microsoft.com/office/word/2010/wordprocessingCanvas" xmlns:cx="http://schemas.microsoft.com/office/drawing/2014/chartex" xmlns:cx1="http://schemas.microsoft.com/office/drawing/2015/9/8/chartex" xmlns:cx2="http://schemas.microsoft.com/office/drawing/2015/10/21/chartex" xmlns:cx3="http://schemas.microsoft.com/office/drawing/2016/5/9/chartex" xmlns:cx4="http://schemas.microsoft.com/office/drawing/2016/5/10/chartex" xmlns:cx5="http://schemas.microsoft.com/office/drawing/2016/5/11/chartex" xmlns:cx6="http://schemas.microsoft.com/office/drawing/2016/5/12/chartex" xmlns:cx7="http://schemas.microsoft.com/office/drawing/2016/5/13/chartex" xmlns:cx8="http://schemas.microsoft.com/office/drawing/2016/5/14/chartex" xmlns:mc="http://schemas.openxmlformats.org/markup-compatibility/2006" xmlns:aink="http://schemas.microsoft.com/office/drawing/2016/ink" xmlns:am3d="http://schemas.microsoft.com/office/drawing/2017/model3d" xmlns:o="urn:schemas-microsoft-com:office:office" xmlns:oel="http://schemas.microsoft.com/office/2019/extlst" xmlns:r="http://schemas.openxmlformats.org/officeDocument/2006/relationships" xmlns:m="http://schemas.openxmlformats.org/officeDocument/2006/math" xmlns:v="urn:schemas-microsoft-com:vml" xmlns:wp14="http://schemas.microsoft.com/office/word/2010/wordprocessingDrawing" xmlns:wp="http://schemas.openxmlformats.org/drawingml/2006/wordprocessingDrawing" xmlns:w10="urn:schemas-microsoft-com:office:word" xmlns:w="http://schemas.openxmlformats.org/wordprocessingml/2006/main" xmlns:w14="http://schemas.microsoft.com/office/word/2010/wordml" xmlns:w15="http://schemas.microsoft.com/office/word/2012/wordml" xmlns:w16cex="http://schemas.microsoft.com/office/word/2018/wordml/cex" xmlns:w16cid="http://schemas.microsoft.com/office/word/2016/wordml/cid" xmlns:w16="http://schemas.microsoft.com/office/word/2018/wordml" xmlns:w16sdtdh="http://schemas.microsoft.com/office/word/2020/wordml/sdtdatahash" xmlns:w16se="http://schemas.microsoft.com/office/word/2015/wordml/symex" xmlns:wpg="http://schemas.microsoft.com/office/word/2010/wordprocessingGroup" xmlns:wpi="http://schemas.microsoft.com/office/word/2010/wordprocessingInk" xmlns:wne="http://schemas.microsoft.com/office/word/2006/wordml" xmlns:wps="http://schemas.microsoft.com/office/word/2010/wordprocessingShape" mc:Ignorable="w14 w15 w16se w16cid w16 w16cex w16sdtdh wp14">
   <w:p>
     <w:pPr>
       <w:pStyle w:val="Header"/>
@@ -9998,7 +10486,7 @@
 </file>
 
 <file path=word/header3.xml><?xml version="1.0" encoding="utf-8"?>
-<w:hdr xmlns:wpc="http://schemas.microsoft.com/office/word/2010/wordprocessingCanvas" xmlns:cx="http://schemas.microsoft.com/office/drawing/2014/chartex" xmlns:cx1="http://schemas.microsoft.com/office/drawing/2015/9/8/chartex" xmlns:cx2="http://schemas.microsoft.com/office/drawing/2015/10/21/chartex" xmlns:cx3="http://schemas.microsoft.com/office/drawing/2016/5/9/chartex" xmlns:cx4="http://schemas.microsoft.com/office/drawing/2016/5/10/chartex" xmlns:cx5="http://schemas.microsoft.com/office/drawing/2016/5/11/chartex" xmlns:cx6="http://schemas.microsoft.com/office/drawing/2016/5/12/chartex" xmlns:cx7="http://schemas.microsoft.com/office/drawing/2016/5/13/chartex" xmlns:cx8="http://schemas.microsoft.com/office/drawing/2016/5/14/chartex" xmlns:mc="http://schemas.openxmlformats.org/markup-compatibility/2006" xmlns:aink="http://schemas.microsoft.com/office/drawing/2016/ink" xmlns:am3d="http://schemas.microsoft.com/office/drawing/2017/model3d" xmlns:o="urn:schemas-microsoft-com:office:office" xmlns:oel="http://schemas.microsoft.com/office/2019/extlst" xmlns:r="http://schemas.openxmlformats.org/officeDocument/2006/relationships" xmlns:m="http://schemas.openxmlformats.org/officeDocument/2006/math" xmlns:v="urn:schemas-microsoft-com:vml" xmlns:wp14="http://schemas.microsoft.com/office/word/2010/wordprocessingDrawing" xmlns:wp="http://schemas.openxmlformats.org/drawingml/2006/wordprocessingDrawing" xmlns:w10="urn:schemas-microsoft-com:office:word" xmlns:w="http://schemas.openxmlformats.org/wordprocessingml/2006/main" xmlns:w14="http://schemas.microsoft.com/office/word/2010/wordml" xmlns:w15="http://schemas.microsoft.com/office/word/2012/wordml" xmlns:w16cex="http://schemas.microsoft.com/office/word/2018/wordml/cex" xmlns:w16cid="http://schemas.microsoft.com/office/word/2016/wordml/cid" xmlns:w16="http://schemas.microsoft.com/office/word/2018/wordml" xmlns:w16du="http://schemas.microsoft.com/office/word/2023/wordml/word16du" xmlns:w16sdtdh="http://schemas.microsoft.com/office/word/2020/wordml/sdtdatahash" xmlns:w16sdtfl="http://schemas.microsoft.com/office/word/2024/wordml/sdtformatlock" xmlns:w16se="http://schemas.microsoft.com/office/word/2015/wordml/symex" xmlns:wpg="http://schemas.microsoft.com/office/word/2010/wordprocessingGroup" xmlns:wpi="http://schemas.microsoft.com/office/word/2010/wordprocessingInk" xmlns:wne="http://schemas.microsoft.com/office/word/2006/wordml" xmlns:wps="http://schemas.microsoft.com/office/word/2010/wordprocessingShape" mc:Ignorable="w14 w15 w16se w16cid w16 w16cex w16sdtdh w16sdtfl w16du wp14">
+<w:hdr xmlns:wpc="http://schemas.microsoft.com/office/word/2010/wordprocessingCanvas" xmlns:cx="http://schemas.microsoft.com/office/drawing/2014/chartex" xmlns:cx1="http://schemas.microsoft.com/office/drawing/2015/9/8/chartex" xmlns:cx2="http://schemas.microsoft.com/office/drawing/2015/10/21/chartex" xmlns:cx3="http://schemas.microsoft.com/office/drawing/2016/5/9/chartex" xmlns:cx4="http://schemas.microsoft.com/office/drawing/2016/5/10/chartex" xmlns:cx5="http://schemas.microsoft.com/office/drawing/2016/5/11/chartex" xmlns:cx6="http://schemas.microsoft.com/office/drawing/2016/5/12/chartex" xmlns:cx7="http://schemas.microsoft.com/office/drawing/2016/5/13/chartex" xmlns:cx8="http://schemas.microsoft.com/office/drawing/2016/5/14/chartex" xmlns:mc="http://schemas.openxmlformats.org/markup-compatibility/2006" xmlns:aink="http://schemas.microsoft.com/office/drawing/2016/ink" xmlns:am3d="http://schemas.microsoft.com/office/drawing/2017/model3d" xmlns:o="urn:schemas-microsoft-com:office:office" xmlns:oel="http://schemas.microsoft.com/office/2019/extlst" xmlns:r="http://schemas.openxmlformats.org/officeDocument/2006/relationships" xmlns:m="http://schemas.openxmlformats.org/officeDocument/2006/math" xmlns:v="urn:schemas-microsoft-com:vml" xmlns:wp14="http://schemas.microsoft.com/office/word/2010/wordprocessingDrawing" xmlns:wp="http://schemas.openxmlformats.org/drawingml/2006/wordprocessingDrawing" xmlns:w10="urn:schemas-microsoft-com:office:word" xmlns:w="http://schemas.openxmlformats.org/wordprocessingml/2006/main" xmlns:w14="http://schemas.microsoft.com/office/word/2010/wordml" xmlns:w15="http://schemas.microsoft.com/office/word/2012/wordml" xmlns:w16cex="http://schemas.microsoft.com/office/word/2018/wordml/cex" xmlns:w16cid="http://schemas.microsoft.com/office/word/2016/wordml/cid" xmlns:w16="http://schemas.microsoft.com/office/word/2018/wordml" xmlns:w16sdtdh="http://schemas.microsoft.com/office/word/2020/wordml/sdtdatahash" xmlns:w16se="http://schemas.microsoft.com/office/word/2015/wordml/symex" xmlns:wpg="http://schemas.microsoft.com/office/word/2010/wordprocessingGroup" xmlns:wpi="http://schemas.microsoft.com/office/word/2010/wordprocessingInk" xmlns:wne="http://schemas.microsoft.com/office/word/2006/wordml" xmlns:wps="http://schemas.microsoft.com/office/word/2010/wordprocessingShape" mc:Ignorable="w14 w15 w16se w16cid w16 w16cex w16sdtdh wp14">
   <w:p>
     <w:pPr>
       <w:pStyle w:val="Header"/>
@@ -10008,7 +10496,7 @@
 </file>
 
 <file path=word/styles.xml><?xml version="1.0" encoding="utf-8"?>
-<w:styles xmlns:mc="http://schemas.openxmlformats.org/markup-compatibility/2006" xmlns:r="http://schemas.openxmlformats.org/officeDocument/2006/relationships" xmlns:w="http://schemas.openxmlformats.org/wordprocessingml/2006/main" xmlns:w14="http://schemas.microsoft.com/office/word/2010/wordml" xmlns:w15="http://schemas.microsoft.com/office/word/2012/wordml" xmlns:w16cex="http://schemas.microsoft.com/office/word/2018/wordml/cex" xmlns:w16cid="http://schemas.microsoft.com/office/word/2016/wordml/cid" xmlns:w16="http://schemas.microsoft.com/office/word/2018/wordml" xmlns:w16du="http://schemas.microsoft.com/office/word/2023/wordml/word16du" xmlns:w16sdtdh="http://schemas.microsoft.com/office/word/2020/wordml/sdtdatahash" xmlns:w16sdtfl="http://schemas.microsoft.com/office/word/2024/wordml/sdtformatlock" xmlns:w16se="http://schemas.microsoft.com/office/word/2015/wordml/symex" mc:Ignorable="w14 w15 w16se w16cid w16 w16cex w16sdtdh w16sdtfl w16du">
+<w:styles xmlns:mc="http://schemas.openxmlformats.org/markup-compatibility/2006" xmlns:r="http://schemas.openxmlformats.org/officeDocument/2006/relationships" xmlns:w="http://schemas.openxmlformats.org/wordprocessingml/2006/main" xmlns:w14="http://schemas.microsoft.com/office/word/2010/wordml" xmlns:w15="http://schemas.microsoft.com/office/word/2012/wordml" xmlns:w16cex="http://schemas.microsoft.com/office/word/2018/wordml/cex" xmlns:w16cid="http://schemas.microsoft.com/office/word/2016/wordml/cid" xmlns:w16="http://schemas.microsoft.com/office/word/2018/wordml" xmlns:w16sdtdh="http://schemas.microsoft.com/office/word/2020/wordml/sdtdatahash" xmlns:w16se="http://schemas.microsoft.com/office/word/2015/wordml/symex" mc:Ignorable="w14 w15 w16se w16cid w16 w16cex w16sdtdh">
   <w:docDefaults>
     <w:rPrDefault>
       <w:rPr>
@@ -10525,7 +11013,6 @@
   <w:style w:type="character" w:default="1" w:styleId="DefaultParagraphFont">
     <w:name w:val="Default Paragraph Font"/>
     <w:uiPriority w:val="1"/>
-    <w:semiHidden/>
     <w:unhideWhenUsed/>
   </w:style>
   <w:style w:type="table" w:default="1" w:styleId="TableNormal">

</xml_diff>